<commit_message>
Align DOCX note formatting
</commit_message>
<xml_diff>
--- a/skills/jvc-meeting-notes/templates/访谈纪要模板.docx
+++ b/skills/jvc-meeting-notes/templates/访谈纪要模板.docx
@@ -68,8 +68,8 @@
       </w:r>
     </w:p>
     <w:sectPr>
-      <w:pgSz w:w="12240" w:h="15840"/>
-      <w:pgMar w:top="1134" w:right="1247" w:bottom="1134" w:left="1247" w:header="720" w:footer="720" w:gutter="0"/>
+      <w:pgSz w:w="11906" w:h="16838"/>
+      <w:pgMar w:top="1440" w:right="1797" w:bottom="1440" w:left="1797" w:header="720" w:footer="720" w:gutter="0"/>
       <w:cols w:space="720"/>
       <w:docGrid w:linePitch="360"/>
     </w:sectPr>
@@ -441,8 +441,8 @@
     <w:qFormat/>
     <w:rsid w:val="00FC693F"/>
     <w:rPr>
-      <w:rFonts w:ascii="Times New Roman" w:hAnsi="Times New Roman" w:eastAsia="Microsoft YaHei"/>
-      <w:sz w:val="21"/>
+      <w:rFonts w:ascii="Times New Roman" w:hAnsi="Times New Roman" w:eastAsia="KaiTi"/>
+      <w:sz w:val="20"/>
     </w:rPr>
   </w:style>
   <w:style w:type="paragraph" w:styleId="Header">
@@ -12130,37 +12130,49 @@
   <w:style w:type="paragraph" w:customStyle="1" w:styleId="JVCNoteTitle">
     <w:name w:val="JVC Note Title"/>
     <w:basedOn w:val="Normal"/>
+    <w:pPr>
+      <w:spacing w:before="0" w:after="0" w:line="240" w:lineRule="auto"/>
+    </w:pPr>
     <w:rPr>
-      <w:rFonts w:ascii="Times New Roman" w:hAnsi="Times New Roman" w:eastAsia="Microsoft YaHei"/>
+      <w:rFonts w:ascii="Times New Roman" w:hAnsi="Times New Roman" w:eastAsia="KaiTi"/>
       <w:b/>
-      <w:sz w:val="32"/>
+      <w:sz w:val="36"/>
     </w:rPr>
   </w:style>
   <w:style w:type="paragraph" w:customStyle="1" w:styleId="JVCSectionHeading">
     <w:name w:val="JVC Section Heading"/>
     <w:basedOn w:val="Normal"/>
+    <w:pPr>
+      <w:spacing w:before="0" w:after="0" w:line="240" w:lineRule="auto"/>
+    </w:pPr>
     <w:rPr>
-      <w:rFonts w:ascii="Times New Roman" w:hAnsi="Times New Roman" w:eastAsia="Microsoft YaHei"/>
+      <w:rFonts w:ascii="Times New Roman" w:hAnsi="Times New Roman" w:eastAsia="KaiTi"/>
       <w:b/>
-      <w:sz w:val="22"/>
+      <w:sz w:val="20"/>
     </w:rPr>
   </w:style>
   <w:style w:type="paragraph" w:customStyle="1" w:styleId="JVCBody">
     <w:name w:val="JVC Body"/>
     <w:basedOn w:val="Normal"/>
+    <w:pPr>
+      <w:spacing w:before="0" w:after="0" w:line="240" w:lineRule="auto"/>
+    </w:pPr>
     <w:rPr>
-      <w:rFonts w:ascii="Times New Roman" w:hAnsi="Times New Roman" w:eastAsia="Microsoft YaHei"/>
+      <w:rFonts w:ascii="Times New Roman" w:hAnsi="Times New Roman" w:eastAsia="KaiTi"/>
       <w:b w:val="0"/>
-      <w:sz w:val="21"/>
+      <w:sz w:val="20"/>
     </w:rPr>
   </w:style>
   <w:style w:type="paragraph" w:customStyle="1" w:styleId="JVCSubsectionHeading">
     <w:name w:val="JVC Subsection Heading"/>
     <w:basedOn w:val="Normal"/>
+    <w:pPr>
+      <w:spacing w:before="0" w:after="0" w:line="240" w:lineRule="auto"/>
+    </w:pPr>
     <w:rPr>
-      <w:rFonts w:ascii="Times New Roman" w:hAnsi="Times New Roman" w:eastAsia="Microsoft YaHei"/>
-      <w:b/>
-      <w:sz w:val="21"/>
+      <w:rFonts w:ascii="Times New Roman" w:hAnsi="Times New Roman" w:eastAsia="KaiTi"/>
+      <w:b w:val="0"/>
+      <w:sz w:val="20"/>
     </w:rPr>
   </w:style>
 </w:styles>

</xml_diff>

<commit_message>
Match DOCX notes to standard format
</commit_message>
<xml_diff>
--- a/skills/jvc-meeting-notes/templates/访谈纪要模板.docx
+++ b/skills/jvc-meeting-notes/templates/访谈纪要模板.docx
@@ -4,77 +4,128 @@
   <w:body>
     <w:p>
       <w:pPr>
-        <w:pStyle w:val="JVCNoteTitle"/>
         <w:jc w:val="center"/>
       </w:pPr>
       <w:r>
-        <w:t>YYYY/mm/dd 线上/线下访谈{项目名称}</w:t>
+        <w:rPr>
+          <w:rFonts w:ascii="Times New Roman" w:hAnsi="Times New Roman" w:eastAsia="KaiTi"/>
+          <w:b/>
+          <w:sz w:val="36"/>
+        </w:rPr>
+        <w:t>YYYY/mm/dd 线上 访谈{项目名称}</w:t>
       </w:r>
     </w:p>
     <w:p>
       <w:pPr>
-        <w:pStyle w:val="JVCSectionHeading"/>
+        <w:jc w:val="both"/>
       </w:pPr>
       <w:r>
+        <w:rPr>
+          <w:rFonts w:ascii="Times New Roman" w:hAnsi="Times New Roman" w:eastAsia="KaiTi"/>
+          <w:b/>
+          <w:sz w:val="20"/>
+        </w:rPr>
         <w:t>一、访谈基本信息</w:t>
       </w:r>
     </w:p>
     <w:p>
       <w:pPr>
-        <w:pStyle w:val="JVCBody"/>
+        <w:jc w:val="both"/>
       </w:pPr>
       <w:r>
+        <w:rPr>
+          <w:rFonts w:ascii="Times New Roman" w:hAnsi="Times New Roman" w:eastAsia="KaiTi"/>
+          <w:b w:val="0"/>
+          <w:sz w:val="20"/>
+        </w:rPr>
         <w:t>这里填写公司/项目、受访人角色、访谈目的和关键背景。</w:t>
       </w:r>
     </w:p>
     <w:p>
       <w:pPr>
-        <w:pStyle w:val="JVCSectionHeading"/>
+        <w:jc w:val="both"/>
       </w:pPr>
       <w:r>
+        <w:rPr>
+          <w:rFonts w:ascii="Times New Roman" w:hAnsi="Times New Roman" w:eastAsia="KaiTi"/>
+          <w:b/>
+          <w:sz w:val="20"/>
+        </w:rPr>
         <w:t>二、核心内容</w:t>
       </w:r>
     </w:p>
     <w:p>
       <w:pPr>
-        <w:pStyle w:val="JVCSubsectionHeading"/>
+        <w:jc w:val="both"/>
       </w:pPr>
       <w:r>
+        <w:rPr>
+          <w:rFonts w:ascii="Times New Roman" w:hAnsi="Times New Roman" w:eastAsia="KaiTi"/>
+          <w:b w:val="0"/>
+          <w:sz w:val="20"/>
+        </w:rPr>
         <w:t>子主题示例</w:t>
       </w:r>
     </w:p>
     <w:p>
       <w:pPr>
-        <w:pStyle w:val="JVCBody"/>
+        <w:jc w:val="both"/>
       </w:pPr>
       <w:r>
+        <w:rPr>
+          <w:rFonts w:ascii="Times New Roman" w:hAnsi="Times New Roman" w:eastAsia="KaiTi"/>
+          <w:b w:val="0"/>
+          <w:sz w:val="20"/>
+        </w:rPr>
         <w:t>这里填写事实、原话、用户观察、未验证项和待追问事项。</w:t>
       </w:r>
     </w:p>
     <w:p>
       <w:pPr>
-        <w:pStyle w:val="JVCSectionHeading"/>
+        <w:jc w:val="both"/>
       </w:pPr>
       <w:r>
+        <w:rPr>
+          <w:rFonts w:ascii="Times New Roman" w:hAnsi="Times New Roman" w:eastAsia="KaiTi"/>
+          <w:b/>
+          <w:sz w:val="20"/>
+        </w:rPr>
         <w:t>三、后续待验证事项</w:t>
       </w:r>
     </w:p>
     <w:p>
       <w:pPr>
-        <w:pStyle w:val="JVCBody"/>
+        <w:jc w:val="both"/>
       </w:pPr>
       <w:r>
+        <w:rPr>
+          <w:rFonts w:ascii="Times New Roman" w:hAnsi="Times New Roman" w:eastAsia="KaiTi"/>
+          <w:b w:val="0"/>
+          <w:sz w:val="20"/>
+        </w:rPr>
         <w:t>这里填写需要交叉验证的问题、材料和下一步动作。</w:t>
       </w:r>
     </w:p>
     <w:sectPr>
+      <w:headerReference w:type="default" r:id="rId9"/>
       <w:pgSz w:w="11906" w:h="16838"/>
-      <w:pgMar w:top="1440" w:right="1797" w:bottom="1440" w:left="1797" w:header="720" w:footer="720" w:gutter="0"/>
-      <w:cols w:space="720"/>
-      <w:docGrid w:linePitch="360"/>
+      <w:pgMar w:top="1440" w:right="1800" w:bottom="1440" w:left="1800" w:header="851" w:footer="992" w:gutter="0"/>
+      <w:cols w:space="425" w:num="1"/>
+      <w:docGrid w:linePitch="312" w:type="lines" w:charSpace="0"/>
     </w:sectPr>
   </w:body>
 </w:document>
+</file>
+
+<file path=word/header1.xml><?xml version="1.0" encoding="utf-8"?>
+<w:hdr xmlns:m="http://schemas.openxmlformats.org/officeDocument/2006/math" xmlns:mc="http://schemas.openxmlformats.org/markup-compatibility/2006" xmlns:mo="http://schemas.microsoft.com/office/mac/office/2008/main" xmlns:mv="urn:schemas-microsoft-com:mac:vml" xmlns:o="urn:schemas-microsoft-com:office:office" xmlns:r="http://schemas.openxmlformats.org/officeDocument/2006/relationships" xmlns:v="urn:schemas-microsoft-com:vml" xmlns:w10="urn:schemas-microsoft-com:office:word" xmlns:w14="http://schemas.microsoft.com/office/word/2010/wordml" xmlns:w="http://schemas.openxmlformats.org/wordprocessingml/2006/main" xmlns:wne="http://schemas.microsoft.com/office/word/2006/wordml" xmlns:wp14="http://schemas.microsoft.com/office/word/2010/wordprocessingDrawing" xmlns:wp="http://schemas.openxmlformats.org/drawingml/2006/wordprocessingDrawing" xmlns:wpc="http://schemas.microsoft.com/office/word/2010/wordprocessingCanvas" xmlns:wpg="http://schemas.microsoft.com/office/word/2010/wordprocessingGroup" xmlns:wpi="http://schemas.microsoft.com/office/word/2010/wordprocessingInk" xmlns:wps="http://schemas.microsoft.com/office/word/2010/wordprocessingShape" mc:Ignorable="w14 wp14">
+  <w:p>
+    <w:pPr>
+      <w:pStyle w:val="Header"/>
+    </w:pPr>
+    <w:r/>
+  </w:p>
+</w:hdr>
 </file>
 
 <file path=word/numbering.xml><?xml version="1.0" encoding="utf-8"?>
@@ -440,10 +491,6 @@
     <w:name w:val="Normal"/>
     <w:qFormat/>
     <w:rsid w:val="00FC693F"/>
-    <w:rPr>
-      <w:rFonts w:ascii="Times New Roman" w:hAnsi="Times New Roman" w:eastAsia="KaiTi"/>
-      <w:sz w:val="20"/>
-    </w:rPr>
   </w:style>
   <w:style w:type="paragraph" w:styleId="Header">
     <w:name w:val="header"/>
@@ -12126,54 +12173,6 @@
         <w:shd w:val="clear" w:color="auto" w:fill="FBCAA2" w:themeFill="accent6" w:themeFillTint="7F"/>
       </w:tcPr>
     </w:tblStylePr>
-  </w:style>
-  <w:style w:type="paragraph" w:customStyle="1" w:styleId="JVCNoteTitle">
-    <w:name w:val="JVC Note Title"/>
-    <w:basedOn w:val="Normal"/>
-    <w:pPr>
-      <w:spacing w:before="0" w:after="0" w:line="240" w:lineRule="auto"/>
-    </w:pPr>
-    <w:rPr>
-      <w:rFonts w:ascii="Times New Roman" w:hAnsi="Times New Roman" w:eastAsia="KaiTi"/>
-      <w:b/>
-      <w:sz w:val="36"/>
-    </w:rPr>
-  </w:style>
-  <w:style w:type="paragraph" w:customStyle="1" w:styleId="JVCSectionHeading">
-    <w:name w:val="JVC Section Heading"/>
-    <w:basedOn w:val="Normal"/>
-    <w:pPr>
-      <w:spacing w:before="0" w:after="0" w:line="240" w:lineRule="auto"/>
-    </w:pPr>
-    <w:rPr>
-      <w:rFonts w:ascii="Times New Roman" w:hAnsi="Times New Roman" w:eastAsia="KaiTi"/>
-      <w:b/>
-      <w:sz w:val="20"/>
-    </w:rPr>
-  </w:style>
-  <w:style w:type="paragraph" w:customStyle="1" w:styleId="JVCBody">
-    <w:name w:val="JVC Body"/>
-    <w:basedOn w:val="Normal"/>
-    <w:pPr>
-      <w:spacing w:before="0" w:after="0" w:line="240" w:lineRule="auto"/>
-    </w:pPr>
-    <w:rPr>
-      <w:rFonts w:ascii="Times New Roman" w:hAnsi="Times New Roman" w:eastAsia="KaiTi"/>
-      <w:b w:val="0"/>
-      <w:sz w:val="20"/>
-    </w:rPr>
-  </w:style>
-  <w:style w:type="paragraph" w:customStyle="1" w:styleId="JVCSubsectionHeading">
-    <w:name w:val="JVC Subsection Heading"/>
-    <w:basedOn w:val="Normal"/>
-    <w:pPr>
-      <w:spacing w:before="0" w:after="0" w:line="240" w:lineRule="auto"/>
-    </w:pPr>
-    <w:rPr>
-      <w:rFonts w:ascii="Times New Roman" w:hAnsi="Times New Roman" w:eastAsia="KaiTi"/>
-      <w:b w:val="0"/>
-      <w:sz w:val="20"/>
-    </w:rPr>
   </w:style>
 </w:styles>
 </file>

</xml_diff>

<commit_message>
Refine talk notes answers and line spacing
</commit_message>
<xml_diff>
--- a/skills/jvc-meeting-notes/templates/访谈纪要模板.docx
+++ b/skills/jvc-meeting-notes/templates/访谈纪要模板.docx
@@ -4,6 +4,7 @@
   <w:body>
     <w:p>
       <w:pPr>
+        <w:spacing w:before="0" w:after="0" w:line="240" w:lineRule="auto"/>
         <w:jc w:val="center"/>
       </w:pPr>
       <w:r>
@@ -17,6 +18,7 @@
     </w:p>
     <w:p>
       <w:pPr>
+        <w:spacing w:before="0" w:after="0" w:line="240" w:lineRule="auto"/>
         <w:jc w:val="both"/>
       </w:pPr>
       <w:r>
@@ -30,6 +32,7 @@
     </w:p>
     <w:p>
       <w:pPr>
+        <w:spacing w:before="0" w:after="0" w:line="240" w:lineRule="auto"/>
         <w:jc w:val="both"/>
       </w:pPr>
       <w:r>
@@ -43,6 +46,7 @@
     </w:p>
     <w:p>
       <w:pPr>
+        <w:spacing w:before="0" w:after="0" w:line="240" w:lineRule="auto"/>
         <w:jc w:val="both"/>
       </w:pPr>
       <w:r>
@@ -56,6 +60,7 @@
     </w:p>
     <w:p>
       <w:pPr>
+        <w:spacing w:before="0" w:after="0" w:line="240" w:lineRule="auto"/>
         <w:jc w:val="both"/>
       </w:pPr>
       <w:r>
@@ -69,6 +74,7 @@
     </w:p>
     <w:p>
       <w:pPr>
+        <w:spacing w:before="0" w:after="0" w:line="240" w:lineRule="auto"/>
         <w:jc w:val="both"/>
       </w:pPr>
       <w:r>
@@ -82,6 +88,7 @@
     </w:p>
     <w:p>
       <w:pPr>
+        <w:spacing w:before="0" w:after="0" w:line="240" w:lineRule="auto"/>
         <w:jc w:val="both"/>
       </w:pPr>
       <w:r>
@@ -95,6 +102,7 @@
     </w:p>
     <w:p>
       <w:pPr>
+        <w:spacing w:before="0" w:after="0" w:line="240" w:lineRule="auto"/>
         <w:jc w:val="both"/>
       </w:pPr>
       <w:r>

</xml_diff>

<commit_message>
[codex] Align DOCX note formatting
Summary:
- Align the default meeting/talk DOCX template with the standard A4 meeting-notes format while keeping public metadata neutral.
- Preserve justified body text but enable doNotExpandShiftReturn so manual line breaks do not over-expand spacing.
- Update jvc-talk-notes to use complete answers, fact dimensions, and verification points instead of repeated question/summary/raw-quote/tag fields.
- Standardize generated DOCX paragraph spacing to single line with zero before/after spacing and add XML-level format checks.

Validation:
- python3 scripts/check-docx-format-consistency.py
- python3 scripts/check-docx-template-customization.py
- bash scripts/check-jvc-assets.sh
- bash scripts/check-talk-notes-assets.sh
- bash scripts/check-review-fixes.sh
</commit_message>
<xml_diff>
--- a/skills/jvc-meeting-notes/templates/访谈纪要模板.docx
+++ b/skills/jvc-meeting-notes/templates/访谈纪要模板.docx
@@ -4,77 +4,136 @@
   <w:body>
     <w:p>
       <w:pPr>
-        <w:pStyle w:val="JVCNoteTitle"/>
+        <w:spacing w:before="0" w:after="0" w:line="240" w:lineRule="auto"/>
         <w:jc w:val="center"/>
       </w:pPr>
       <w:r>
-        <w:t>YYYY/mm/dd 线上/线下访谈{项目名称}</w:t>
+        <w:rPr>
+          <w:rFonts w:ascii="Times New Roman" w:hAnsi="Times New Roman" w:eastAsia="KaiTi"/>
+          <w:b/>
+          <w:sz w:val="36"/>
+        </w:rPr>
+        <w:t>YYYY/mm/dd 线上 访谈{项目名称}</w:t>
       </w:r>
     </w:p>
     <w:p>
       <w:pPr>
-        <w:pStyle w:val="JVCSectionHeading"/>
+        <w:spacing w:before="0" w:after="0" w:line="240" w:lineRule="auto"/>
+        <w:jc w:val="both"/>
       </w:pPr>
       <w:r>
+        <w:rPr>
+          <w:rFonts w:ascii="Times New Roman" w:hAnsi="Times New Roman" w:eastAsia="KaiTi"/>
+          <w:b/>
+          <w:sz w:val="20"/>
+        </w:rPr>
         <w:t>一、访谈基本信息</w:t>
       </w:r>
     </w:p>
     <w:p>
       <w:pPr>
-        <w:pStyle w:val="JVCBody"/>
+        <w:spacing w:before="0" w:after="0" w:line="240" w:lineRule="auto"/>
+        <w:jc w:val="both"/>
       </w:pPr>
       <w:r>
+        <w:rPr>
+          <w:rFonts w:ascii="Times New Roman" w:hAnsi="Times New Roman" w:eastAsia="KaiTi"/>
+          <w:b w:val="0"/>
+          <w:sz w:val="20"/>
+        </w:rPr>
         <w:t>这里填写公司/项目、受访人角色、访谈目的和关键背景。</w:t>
       </w:r>
     </w:p>
     <w:p>
       <w:pPr>
-        <w:pStyle w:val="JVCSectionHeading"/>
+        <w:spacing w:before="0" w:after="0" w:line="240" w:lineRule="auto"/>
+        <w:jc w:val="both"/>
       </w:pPr>
       <w:r>
+        <w:rPr>
+          <w:rFonts w:ascii="Times New Roman" w:hAnsi="Times New Roman" w:eastAsia="KaiTi"/>
+          <w:b/>
+          <w:sz w:val="20"/>
+        </w:rPr>
         <w:t>二、核心内容</w:t>
       </w:r>
     </w:p>
     <w:p>
       <w:pPr>
-        <w:pStyle w:val="JVCSubsectionHeading"/>
+        <w:spacing w:before="0" w:after="0" w:line="240" w:lineRule="auto"/>
+        <w:jc w:val="both"/>
       </w:pPr>
       <w:r>
+        <w:rPr>
+          <w:rFonts w:ascii="Times New Roman" w:hAnsi="Times New Roman" w:eastAsia="KaiTi"/>
+          <w:b w:val="0"/>
+          <w:sz w:val="20"/>
+        </w:rPr>
         <w:t>子主题示例</w:t>
       </w:r>
     </w:p>
     <w:p>
       <w:pPr>
-        <w:pStyle w:val="JVCBody"/>
+        <w:spacing w:before="0" w:after="0" w:line="240" w:lineRule="auto"/>
+        <w:jc w:val="both"/>
       </w:pPr>
       <w:r>
+        <w:rPr>
+          <w:rFonts w:ascii="Times New Roman" w:hAnsi="Times New Roman" w:eastAsia="KaiTi"/>
+          <w:b w:val="0"/>
+          <w:sz w:val="20"/>
+        </w:rPr>
         <w:t>这里填写事实、原话、用户观察、未验证项和待追问事项。</w:t>
       </w:r>
     </w:p>
     <w:p>
       <w:pPr>
-        <w:pStyle w:val="JVCSectionHeading"/>
+        <w:spacing w:before="0" w:after="0" w:line="240" w:lineRule="auto"/>
+        <w:jc w:val="both"/>
       </w:pPr>
       <w:r>
+        <w:rPr>
+          <w:rFonts w:ascii="Times New Roman" w:hAnsi="Times New Roman" w:eastAsia="KaiTi"/>
+          <w:b/>
+          <w:sz w:val="20"/>
+        </w:rPr>
         <w:t>三、后续待验证事项</w:t>
       </w:r>
     </w:p>
     <w:p>
       <w:pPr>
-        <w:pStyle w:val="JVCBody"/>
+        <w:spacing w:before="0" w:after="0" w:line="240" w:lineRule="auto"/>
+        <w:jc w:val="both"/>
       </w:pPr>
       <w:r>
+        <w:rPr>
+          <w:rFonts w:ascii="Times New Roman" w:hAnsi="Times New Roman" w:eastAsia="KaiTi"/>
+          <w:b w:val="0"/>
+          <w:sz w:val="20"/>
+        </w:rPr>
         <w:t>这里填写需要交叉验证的问题、材料和下一步动作。</w:t>
       </w:r>
     </w:p>
     <w:sectPr>
-      <w:pgSz w:w="12240" w:h="15840"/>
-      <w:pgMar w:top="1134" w:right="1247" w:bottom="1134" w:left="1247" w:header="720" w:footer="720" w:gutter="0"/>
-      <w:cols w:space="720"/>
-      <w:docGrid w:linePitch="360"/>
+      <w:headerReference w:type="default" r:id="rId9"/>
+      <w:pgSz w:w="11906" w:h="16838"/>
+      <w:pgMar w:top="1440" w:right="1800" w:bottom="1440" w:left="1800" w:header="851" w:footer="992" w:gutter="0"/>
+      <w:cols w:space="425" w:num="1"/>
+      <w:docGrid w:linePitch="312" w:type="lines" w:charSpace="0"/>
     </w:sectPr>
   </w:body>
 </w:document>
+</file>
+
+<file path=word/header1.xml><?xml version="1.0" encoding="utf-8"?>
+<w:hdr xmlns:m="http://schemas.openxmlformats.org/officeDocument/2006/math" xmlns:mc="http://schemas.openxmlformats.org/markup-compatibility/2006" xmlns:mo="http://schemas.microsoft.com/office/mac/office/2008/main" xmlns:mv="urn:schemas-microsoft-com:mac:vml" xmlns:o="urn:schemas-microsoft-com:office:office" xmlns:r="http://schemas.openxmlformats.org/officeDocument/2006/relationships" xmlns:v="urn:schemas-microsoft-com:vml" xmlns:w10="urn:schemas-microsoft-com:office:word" xmlns:w14="http://schemas.microsoft.com/office/word/2010/wordml" xmlns:w="http://schemas.openxmlformats.org/wordprocessingml/2006/main" xmlns:wne="http://schemas.microsoft.com/office/word/2006/wordml" xmlns:wp14="http://schemas.microsoft.com/office/word/2010/wordprocessingDrawing" xmlns:wp="http://schemas.openxmlformats.org/drawingml/2006/wordprocessingDrawing" xmlns:wpc="http://schemas.microsoft.com/office/word/2010/wordprocessingCanvas" xmlns:wpg="http://schemas.microsoft.com/office/word/2010/wordprocessingGroup" xmlns:wpi="http://schemas.microsoft.com/office/word/2010/wordprocessingInk" xmlns:wps="http://schemas.microsoft.com/office/word/2010/wordprocessingShape" mc:Ignorable="w14 wp14">
+  <w:p>
+    <w:pPr>
+      <w:pStyle w:val="Header"/>
+    </w:pPr>
+    <w:r/>
+  </w:p>
+</w:hdr>
 </file>
 
 <file path=word/numbering.xml><?xml version="1.0" encoding="utf-8"?>
@@ -440,10 +499,6 @@
     <w:name w:val="Normal"/>
     <w:qFormat/>
     <w:rsid w:val="00FC693F"/>
-    <w:rPr>
-      <w:rFonts w:ascii="Times New Roman" w:hAnsi="Times New Roman" w:eastAsia="Microsoft YaHei"/>
-      <w:sz w:val="21"/>
-    </w:rPr>
   </w:style>
   <w:style w:type="paragraph" w:styleId="Header">
     <w:name w:val="header"/>
@@ -12126,42 +12181,6 @@
         <w:shd w:val="clear" w:color="auto" w:fill="FBCAA2" w:themeFill="accent6" w:themeFillTint="7F"/>
       </w:tcPr>
     </w:tblStylePr>
-  </w:style>
-  <w:style w:type="paragraph" w:customStyle="1" w:styleId="JVCNoteTitle">
-    <w:name w:val="JVC Note Title"/>
-    <w:basedOn w:val="Normal"/>
-    <w:rPr>
-      <w:rFonts w:ascii="Times New Roman" w:hAnsi="Times New Roman" w:eastAsia="Microsoft YaHei"/>
-      <w:b/>
-      <w:sz w:val="32"/>
-    </w:rPr>
-  </w:style>
-  <w:style w:type="paragraph" w:customStyle="1" w:styleId="JVCSectionHeading">
-    <w:name w:val="JVC Section Heading"/>
-    <w:basedOn w:val="Normal"/>
-    <w:rPr>
-      <w:rFonts w:ascii="Times New Roman" w:hAnsi="Times New Roman" w:eastAsia="Microsoft YaHei"/>
-      <w:b/>
-      <w:sz w:val="22"/>
-    </w:rPr>
-  </w:style>
-  <w:style w:type="paragraph" w:customStyle="1" w:styleId="JVCBody">
-    <w:name w:val="JVC Body"/>
-    <w:basedOn w:val="Normal"/>
-    <w:rPr>
-      <w:rFonts w:ascii="Times New Roman" w:hAnsi="Times New Roman" w:eastAsia="Microsoft YaHei"/>
-      <w:b w:val="0"/>
-      <w:sz w:val="21"/>
-    </w:rPr>
-  </w:style>
-  <w:style w:type="paragraph" w:customStyle="1" w:styleId="JVCSubsectionHeading">
-    <w:name w:val="JVC Subsection Heading"/>
-    <w:basedOn w:val="Normal"/>
-    <w:rPr>
-      <w:rFonts w:ascii="Times New Roman" w:hAnsi="Times New Roman" w:eastAsia="Microsoft YaHei"/>
-      <w:b/>
-      <w:sz w:val="21"/>
-    </w:rPr>
   </w:style>
 </w:styles>
 </file>

</xml_diff>